<commit_message>
Update dashboard & recovery with 2026-09-13 Run & Swim workouts (W37 settlement)
</commit_message>
<xml_diff>
--- a/docs/weekly/2026-W37_當週執行率回顧報告.docx
+++ b/docs/weekly/2026-W37_當週執行率回顧報告.docx
@@ -21,7 +21,7 @@
           <w:color w:val="555555"/>
           <w:sz w:val="20"/>
         </w:rPr>
-        <w:t>週期：2026/09/07–2026/09/13　｜　整體時間執行率：65.6%</w:t>
+        <w:t>週期：2026/09/07–2026/09/13　｜　整體時間執行率：83.4%</w:t>
       </w:r>
     </w:p>
     <w:p>
@@ -347,7 +347,7 @@
                 <w:color w:val="000000"/>
                 <w:sz w:val="19"/>
               </w:rPr>
-              <w:t>2.00 hr</w:t>
+              <w:t>3.07 hr</w:t>
             </w:r>
           </w:p>
         </w:tc>
@@ -374,7 +374,7 @@
                 <w:color w:val="000000"/>
                 <w:sz w:val="19"/>
               </w:rPr>
-              <w:t>48.0%</w:t>
+              <w:t>73.6%</w:t>
             </w:r>
           </w:p>
         </w:tc>
@@ -428,7 +428,7 @@
                 <w:color w:val="000000"/>
                 <w:sz w:val="19"/>
               </w:rPr>
-              <w:t>6.40 km</w:t>
+              <w:t>9.60 km</w:t>
             </w:r>
           </w:p>
         </w:tc>
@@ -455,7 +455,7 @@
                 <w:color w:val="000000"/>
                 <w:sz w:val="19"/>
               </w:rPr>
-              <w:t>200.0%</w:t>
+              <w:t>300.0%</w:t>
             </w:r>
           </w:p>
         </w:tc>
@@ -783,7 +783,7 @@
                 <w:color w:val="000000"/>
                 <w:sz w:val="19"/>
               </w:rPr>
-              <w:t>2.45 hr</w:t>
+              <w:t>3.93 hr</w:t>
             </w:r>
           </w:p>
         </w:tc>
@@ -810,7 +810,7 @@
                 <w:color w:val="000000"/>
                 <w:sz w:val="19"/>
               </w:rPr>
-              <w:t>61.3%</w:t>
+              <w:t>98.3%</w:t>
             </w:r>
           </w:p>
         </w:tc>
@@ -864,7 +864,7 @@
                 <w:color w:val="000000"/>
                 <w:sz w:val="19"/>
               </w:rPr>
-              <w:t>22.21 km</w:t>
+              <w:t>34.48 km</w:t>
             </w:r>
           </w:p>
         </w:tc>
@@ -891,7 +891,7 @@
                 <w:color w:val="000000"/>
                 <w:sz w:val="19"/>
               </w:rPr>
-              <w:t>59.9%</w:t>
+              <w:t>92.9%</w:t>
             </w:r>
           </w:p>
         </w:tc>
@@ -2793,7 +2793,7 @@
                 <w:color w:val="000000"/>
                 <w:sz w:val="19"/>
               </w:rPr>
-              <w:t>0分</w:t>
+              <w:t>89分 / 12.27km</w:t>
             </w:r>
           </w:p>
         </w:tc>
@@ -2820,7 +2820,7 @@
                 <w:color w:val="000000"/>
                 <w:sz w:val="19"/>
               </w:rPr>
-              <w:t>❌ 未執行/待排程</w:t>
+              <w:t>✅ 精準達標 (99%, A+)</w:t>
             </w:r>
           </w:p>
         </w:tc>
@@ -2959,7 +2959,7 @@
                 <w:color w:val="000000"/>
                 <w:sz w:val="19"/>
               </w:rPr>
-              <w:t>0分</w:t>
+              <w:t>64分 / 3.20km</w:t>
             </w:r>
           </w:p>
         </w:tc>
@@ -2986,7 +2986,7 @@
                 <w:color w:val="000000"/>
                 <w:sz w:val="19"/>
               </w:rPr>
-              <w:t>❌ 未執行/待排程</w:t>
+              <w:t>🟢 良好達標 (91%, A-)</w:t>
             </w:r>
           </w:p>
         </w:tc>
@@ -3013,11 +3013,15 @@
     </w:p>
     <w:p>
       <w:r>
-        <w:t>• 當週累積自行車 123.23 km、跑步 22.21 km、游泳 6.40 km，整體時間執行率達 65.6%。</w:t>
+        <w:t>• 當週累積自行車 123.23 km、跑步 34.48 km、游泳 9.60 km，整體時間執行率達 83.4%。</w:t>
         <w:br/>
       </w:r>
       <w:r>
-        <w:t>• Build 1-2 第一建構期第二週扎實推進：週一完全休息超補償後，週二晨跑超額達標 (12.5km)、週三長池甜甜長游高效巡航 (3.15km)、週四單車 TEMPO 3x18' 完美吃下 (42.8km)、週五長池甜甜長游高水準達標 (3.25km)、週六北海岸長騎 59.6km ＋ 轉換跑 9.73km (60分鐘) 關鍵雙課表圓滿達成！本週已累積自行車 123.23 km、跑步 22.21 km、游泳 6.40 km，三項總時長達 9.4 小時 (整體時間執行率達 65.6%)，三項總負荷強勢突破 585+ TSS！</w:t>
+        <w:t>• Build 1-2 第一建構期第二週圓滿結算：週一完全休息超補償後，週二晨跑超額達標 (12.5km)、週三長池甜甜長游高效巡航 (3.15km)、週四單車 TEMPO 3x18' 完美吃下 (42.8km)、週五長池甜甜長游高水準達標 (3.25km)、週六北海岸長騎 59.6km ＋ 轉換跑 9.73km (60分鐘) 關鍵雙課表，今日週日順利完成清晨 EASY 有氧跑 12.27km (90分鐘) 與下午 50m 長池 3,200m 比賽配速長游！全週圓滿結算自行車 123.23 km (4.95 小時, 243.5 TSS)、跑步 34.48 km (3.93 小時, 180.7 rTSS)、游泳 9.60 km (3.07 小時, 304.6 sTSS)，三項總時長達 11.9 小時 (~12.0 小時) (整體時間執行率達 83.4%)，三項總負荷強勢衝破 728.8 TSS (突破 725+ TSS)！</w:t>
+        <w:br/>
+      </w:r>
+      <w:r>
+        <w:t>• 週日清晨 EASY 跑 12.27km (50.3 rTSS) ＋ 下午 50m 長池 3,200m 比賽配速長游 (92.9 sTSS) 雙課表：9/13 清晨跑步 1 小時 29 分 56 秒完成 12.27 km (均速 7:19/km, 8.19 km/h, 最快 4:48/km, 均心 134 bpm, 最高 161 bpm, 恢復區佔 94.7%, 均瓦 209W 3.07W/kg, 最大 396W, 做功 1,127.7 kJ, 均步頻 162 spm, IF 0.548, 50.31 rTSS, 消耗 815 kcal, 體感自覺滿分 5/5 ｜ RPE 3/10 輕鬆有氧)，昨日長騎與轉換跑後雙腿輕盈，心率零漂移達成超高水準動態排酸與有氧耐力堆疊；下午游泳 1 小時 04 分 20 秒完成 3,200 m (均速 2:00.8/100m, 標準化速度 2:00.6/100m, 均心 136 bpm, 最高 166 bpm, 均划頻 25 spm, 均划幅 1.99m/stroke, 脫鉤率 Spd:HR -4.97% 負脫鉤, 92.92 sTSS, IF 0.930, 消耗 621 kcal, 體感 3/3)，比賽配速游程穩定流暢，核心流線型與水下抓抱推水發揮出色，長池水壓與浮力深度排酸。單日合計 2 小時 34 分、15.47 km、143.2 TSS、燃燒 1,436 kcal！</w:t>
         <w:br/>
       </w:r>
       <w:r>

</xml_diff>